<commit_message>
Değişiklik günlüğüne hafıza kaydı eklendi
Word dosyası, geçmişi de taşıyan üreticiden yeniden üretildi. Önce XML'e
doğrudan paragraf klonlayarak eklemeyi denedim ve dosyayı bozdum: kopyalanan
biçim şablonundaki fazla run'ları boşaltırken etiket dengesi kayboldu. Geri
alınıp üreticiye yeni kayıt eklendi — biçim tek yerde kalıyor, sonraki
kayıtlar da oradan geçecek.

Co-Authored-By: Claude Opus 5 <noreply@anthropic.com>
</commit_message>
<xml_diff>
--- a/Vellum - Degisiklik Gunlugu.docx
+++ b/Vellum - Degisiklik Gunlugu.docx
@@ -247,7 +247,7 @@
                 <w:sz w:val="19"/>
                 <w:szCs w:val="19"/>
               </w:rPr>
-              <w:t xml:space="preserve">Sohbete takvim ve proje yazma yetkisi; yazılı sayfa kaldırıldı</w:t>
+              <w:t xml:space="preserve">Kalıcı kullanıcı hafızası</w:t>
             </w:r>
           </w:p>
         </w:tc>
@@ -272,7 +272,7 @@
                 <w:sz w:val="19"/>
                 <w:szCs w:val="19"/>
               </w:rPr>
-              <w:t xml:space="preserve">f96eba6</w:t>
+              <w:t xml:space="preserve">8fe9e8d</w:t>
             </w:r>
           </w:p>
         </w:tc>
@@ -324,7 +324,7 @@
                 <w:sz w:val="19"/>
                 <w:szCs w:val="19"/>
               </w:rPr>
-              <w:t xml:space="preserve">Yazı kutusu hatası düzeltildi; Spline iptal</w:t>
+              <w:t xml:space="preserve">Sohbete takvim ve proje yazma yetkisi; yazılı sayfa kaldırıldı</w:t>
             </w:r>
           </w:p>
         </w:tc>
@@ -349,7 +349,7 @@
                 <w:sz w:val="19"/>
                 <w:szCs w:val="19"/>
               </w:rPr>
-              <w:t xml:space="preserve">20fab79</w:t>
+              <w:t xml:space="preserve">f96eba6</w:t>
             </w:r>
           </w:p>
         </w:tc>
@@ -401,7 +401,7 @@
                 <w:sz w:val="19"/>
                 <w:szCs w:val="19"/>
               </w:rPr>
-              <w:t xml:space="preserve">Sesli mod: panel konuşuyor ve dinliyor</w:t>
+              <w:t xml:space="preserve">Yazı kutusu hatası düzeltildi; Spline iptal</w:t>
             </w:r>
           </w:p>
         </w:tc>
@@ -426,7 +426,7 @@
                 <w:sz w:val="19"/>
                 <w:szCs w:val="19"/>
               </w:rPr>
-              <w:t xml:space="preserve">2cf3f0f</w:t>
+              <w:t xml:space="preserve">20fab79</w:t>
             </w:r>
           </w:p>
         </w:tc>
@@ -453,7 +453,7 @@
                 <w:sz w:val="19"/>
                 <w:szCs w:val="19"/>
               </w:rPr>
-              <w:t xml:space="preserve">10 Eyl 2026</w:t>
+              <w:t xml:space="preserve">11 Eyl 2026</w:t>
             </w:r>
           </w:p>
         </w:tc>
@@ -478,7 +478,7 @@
                 <w:sz w:val="19"/>
                 <w:szCs w:val="19"/>
               </w:rPr>
-              <w:t xml:space="preserve">Dokümanlar Fluent 2'ye ve bugünkü mimariye göre güncellendi</w:t>
+              <w:t xml:space="preserve">Sesli mod: panel konuşuyor ve dinliyor</w:t>
             </w:r>
           </w:p>
         </w:tc>
@@ -503,7 +503,7 @@
                 <w:sz w:val="19"/>
                 <w:szCs w:val="19"/>
               </w:rPr>
-              <w:t xml:space="preserve">e22f62e</w:t>
+              <w:t xml:space="preserve">2cf3f0f</w:t>
             </w:r>
           </w:p>
         </w:tc>
@@ -555,7 +555,7 @@
                 <w:sz w:val="19"/>
                 <w:szCs w:val="19"/>
               </w:rPr>
-              <w:t xml:space="preserve">Instagram DM; Ajanda kaldırıldı; öncelikler adlandırıldı</w:t>
+              <w:t xml:space="preserve">Dokümanlar Fluent 2'ye ve bugünkü mimariye göre güncellendi</w:t>
             </w:r>
           </w:p>
         </w:tc>
@@ -580,7 +580,7 @@
                 <w:sz w:val="19"/>
                 <w:szCs w:val="19"/>
               </w:rPr>
-              <w:t xml:space="preserve">263a8b1</w:t>
+              <w:t xml:space="preserve">e22f62e</w:t>
             </w:r>
           </w:p>
         </w:tc>
@@ -632,7 +632,7 @@
                 <w:sz w:val="19"/>
                 <w:szCs w:val="19"/>
               </w:rPr>
-              <w:t xml:space="preserve">Panel bileşenleri Fluent 2'ye geçirildi</w:t>
+              <w:t xml:space="preserve">Instagram DM; Ajanda kaldırıldı; öncelikler adlandırıldı</w:t>
             </w:r>
           </w:p>
         </w:tc>
@@ -657,7 +657,7 @@
                 <w:sz w:val="19"/>
                 <w:szCs w:val="19"/>
               </w:rPr>
-              <w:t xml:space="preserve">e5e6b59</w:t>
+              <w:t xml:space="preserve">263a8b1</w:t>
             </w:r>
           </w:p>
         </w:tc>
@@ -684,7 +684,7 @@
                 <w:sz w:val="19"/>
                 <w:szCs w:val="19"/>
               </w:rPr>
-              <w:t xml:space="preserve">9 Eyl 2026</w:t>
+              <w:t xml:space="preserve">10 Eyl 2026</w:t>
             </w:r>
           </w:p>
         </w:tc>
@@ -709,7 +709,7 @@
                 <w:sz w:val="19"/>
                 <w:szCs w:val="19"/>
               </w:rPr>
-              <w:t xml:space="preserve">Anahtar kelime sözlüğü, Konular sayfası, yazışma sinyali</w:t>
+              <w:t xml:space="preserve">Panel bileşenleri Fluent 2'ye geçirildi</w:t>
             </w:r>
           </w:p>
         </w:tc>
@@ -734,7 +734,7 @@
                 <w:sz w:val="19"/>
                 <w:szCs w:val="19"/>
               </w:rPr>
-              <w:t xml:space="preserve">1de3b2d</w:t>
+              <w:t xml:space="preserve">e5e6b59</w:t>
             </w:r>
           </w:p>
         </w:tc>
@@ -786,7 +786,7 @@
                 <w:sz w:val="19"/>
                 <w:szCs w:val="19"/>
               </w:rPr>
-              <w:t xml:space="preserve">Takvim sayfası, otomatik etkinlik ve hatırlatma</w:t>
+              <w:t xml:space="preserve">Anahtar kelime sözlüğü, Konular sayfası, yazışma sinyali</w:t>
             </w:r>
           </w:p>
         </w:tc>
@@ -811,7 +811,7 @@
                 <w:sz w:val="19"/>
                 <w:szCs w:val="19"/>
               </w:rPr>
-              <w:t xml:space="preserve">e480baa</w:t>
+              <w:t xml:space="preserve">1de3b2d</w:t>
             </w:r>
           </w:p>
         </w:tc>
@@ -838,7 +838,7 @@
                 <w:sz w:val="19"/>
                 <w:szCs w:val="19"/>
               </w:rPr>
-              <w:t xml:space="preserve">8 Eyl 2026</w:t>
+              <w:t xml:space="preserve">9 Eyl 2026</w:t>
             </w:r>
           </w:p>
         </w:tc>
@@ -863,7 +863,7 @@
                 <w:sz w:val="19"/>
                 <w:szCs w:val="19"/>
               </w:rPr>
-              <w:t xml:space="preserve">Yapı dokümanı güncellendi</w:t>
+              <w:t xml:space="preserve">Takvim sayfası, otomatik etkinlik ve hatırlatma</w:t>
             </w:r>
           </w:p>
         </w:tc>
@@ -888,7 +888,7 @@
                 <w:sz w:val="19"/>
                 <w:szCs w:val="19"/>
               </w:rPr>
-              <w:t xml:space="preserve">93fd1d3</w:t>
+              <w:t xml:space="preserve">e480baa</w:t>
             </w:r>
           </w:p>
         </w:tc>
@@ -940,7 +940,7 @@
                 <w:sz w:val="19"/>
                 <w:szCs w:val="19"/>
               </w:rPr>
-              <w:t xml:space="preserve">Kural tabanlı skorlama, canlı izleme, maliyet düşürme</w:t>
+              <w:t xml:space="preserve">Yapı dokümanı güncellendi</w:t>
             </w:r>
           </w:p>
         </w:tc>
@@ -965,7 +965,7 @@
                 <w:sz w:val="19"/>
                 <w:szCs w:val="19"/>
               </w:rPr>
-              <w:t xml:space="preserve">23d288d</w:t>
+              <w:t xml:space="preserve">93fd1d3</w:t>
             </w:r>
           </w:p>
         </w:tc>
@@ -992,7 +992,7 @@
                 <w:sz w:val="19"/>
                 <w:szCs w:val="19"/>
               </w:rPr>
-              <w:t xml:space="preserve">7 Eyl 2026</w:t>
+              <w:t xml:space="preserve">8 Eyl 2026</w:t>
             </w:r>
           </w:p>
         </w:tc>
@@ -1017,7 +1017,7 @@
                 <w:sz w:val="19"/>
                 <w:szCs w:val="19"/>
               </w:rPr>
-              <w:t xml:space="preserve">Ürün adı Vellum'a çevrildi</w:t>
+              <w:t xml:space="preserve">Kural tabanlı skorlama, canlı izleme, maliyet düşürme</w:t>
             </w:r>
           </w:p>
         </w:tc>
@@ -1042,7 +1042,7 @@
                 <w:sz w:val="19"/>
                 <w:szCs w:val="19"/>
               </w:rPr>
-              <w:t xml:space="preserve">95252f9</w:t>
+              <w:t xml:space="preserve">23d288d</w:t>
             </w:r>
           </w:p>
         </w:tc>
@@ -1094,6 +1094,83 @@
                 <w:sz w:val="19"/>
                 <w:szCs w:val="19"/>
               </w:rPr>
+              <w:t xml:space="preserve">Ürün adı Vellum'a çevrildi</w:t>
+            </w:r>
+          </w:p>
+        </w:tc>
+        <w:tc>
+          <w:tcPr>
+            <w:tcW w:type="dxa" w:w="1200"/>
+            <w:tcMar>
+              <w:top w:type="dxa" w:w="80"/>
+              <w:left w:type="dxa" w:w="120"/>
+              <w:bottom w:type="dxa" w:w="80"/>
+              <w:right w:type="dxa" w:w="120"/>
+            </w:tcMar>
+          </w:tcPr>
+          <w:p>
+            <w:pPr>
+              <w:spacing w:after="0" w:line="260"/>
+            </w:pPr>
+            <w:r>
+              <w:rPr>
+                <w:rFonts w:ascii="Segoe UI" w:cs="Segoe UI" w:eastAsia="Segoe UI" w:hAnsi="Segoe UI"/>
+                <w:color w:val="616161"/>
+                <w:sz w:val="19"/>
+                <w:szCs w:val="19"/>
+              </w:rPr>
+              <w:t xml:space="preserve">95252f9</w:t>
+            </w:r>
+          </w:p>
+        </w:tc>
+      </w:tr>
+      <w:tr>
+        <w:tc>
+          <w:tcPr>
+            <w:tcW w:type="dxa" w:w="1500"/>
+            <w:tcMar>
+              <w:top w:type="dxa" w:w="80"/>
+              <w:left w:type="dxa" w:w="120"/>
+              <w:bottom w:type="dxa" w:w="80"/>
+              <w:right w:type="dxa" w:w="120"/>
+            </w:tcMar>
+          </w:tcPr>
+          <w:p>
+            <w:pPr>
+              <w:spacing w:after="0" w:line="260"/>
+            </w:pPr>
+            <w:r>
+              <w:rPr>
+                <w:rFonts w:ascii="Segoe UI" w:cs="Segoe UI" w:eastAsia="Segoe UI" w:hAnsi="Segoe UI"/>
+                <w:color w:val="616161"/>
+                <w:sz w:val="19"/>
+                <w:szCs w:val="19"/>
+              </w:rPr>
+              <w:t xml:space="preserve">7 Eyl 2026</w:t>
+            </w:r>
+          </w:p>
+        </w:tc>
+        <w:tc>
+          <w:tcPr>
+            <w:tcW w:type="dxa" w:w="6300"/>
+            <w:tcMar>
+              <w:top w:type="dxa" w:w="80"/>
+              <w:left w:type="dxa" w:w="120"/>
+              <w:bottom w:type="dxa" w:w="80"/>
+              <w:right w:type="dxa" w:w="120"/>
+            </w:tcMar>
+          </w:tcPr>
+          <w:p>
+            <w:pPr>
+              <w:spacing w:after="0" w:line="260"/>
+            </w:pPr>
+            <w:r>
+              <w:rPr>
+                <w:rFonts w:ascii="Segoe UI" w:cs="Segoe UI" w:eastAsia="Segoe UI" w:hAnsi="Segoe UI"/>
+                <w:color w:val="616161"/>
+                <w:sz w:val="19"/>
+                <w:szCs w:val="19"/>
+              </w:rPr>
               <w:t xml:space="preserve">İlk sürüm</w:t>
             </w:r>
           </w:p>
@@ -1145,6 +1222,201 @@
           <w:szCs w:val="30"/>
         </w:rPr>
         <w:t xml:space="preserve">11 Eylül 2026</w:t>
+      </w:r>
+    </w:p>
+    <w:p>
+      <w:pPr>
+        <w:pStyle w:val="Heading2"/>
+        <w:spacing w:after="40" w:before="300"/>
+      </w:pPr>
+      <w:r>
+        <w:rPr>
+          <w:rFonts w:ascii="Segoe UI" w:cs="Segoe UI" w:eastAsia="Segoe UI" w:hAnsi="Segoe UI"/>
+          <w:b/>
+          <w:bCs/>
+          <w:color w:val="242424"/>
+          <w:sz w:val="24"/>
+          <w:szCs w:val="24"/>
+        </w:rPr>
+        <w:t xml:space="preserve">Kalıcı kullanıcı hafızası</w:t>
+      </w:r>
+    </w:p>
+    <w:p>
+      <w:pPr>
+        <w:pBdr>
+          <w:bottom w:val="single" w:color="e0e0e0" w:sz="6" w:space="6"/>
+        </w:pBdr>
+        <w:spacing w:after="140"/>
+      </w:pPr>
+      <w:r>
+        <w:rPr>
+          <w:rFonts w:ascii="Segoe UI" w:cs="Segoe UI" w:eastAsia="Segoe UI" w:hAnsi="Segoe UI"/>
+          <w:color w:val="616161"/>
+          <w:sz w:val="17"/>
+          <w:szCs w:val="17"/>
+        </w:rPr>
+        <w:t xml:space="preserve">11 Eylül 2026   ·   8fe9e8d</w:t>
+      </w:r>
+    </w:p>
+    <w:p>
+      <w:pPr>
+        <w:spacing w:after="120" w:line="276"/>
+      </w:pPr>
+      <w:r>
+        <w:rPr>
+          <w:rFonts w:ascii="Segoe UI" w:cs="Segoe UI" w:eastAsia="Segoe UI" w:hAnsi="Segoe UI"/>
+          <w:color w:val="242424"/>
+          <w:sz w:val="21"/>
+          <w:szCs w:val="21"/>
+        </w:rPr>
+        <w:t xml:space="preserve">Vellum artık kullanıldıkça kullanıcıyı tanıyor: mesleği, ilgi alanları, gittiği yerler, sık görüştüğü kişiler. Öğrendiği her şey kalıcı olarak saklanıyor ve maillerin önem sırasına giriyor.</w:t>
+      </w:r>
+    </w:p>
+    <w:p>
+      <w:pPr>
+        <w:pStyle w:val="ListParagraph"/>
+        <w:numPr>
+          <w:ilvl w:val="0"/>
+          <w:numId w:val="2"/>
+        </w:numPr>
+        <w:spacing w:after="60" w:line="276"/>
+      </w:pPr>
+      <w:r>
+        <w:rPr>
+          <w:rFonts w:ascii="Segoe UI" w:cs="Segoe UI" w:eastAsia="Segoe UI" w:hAnsi="Segoe UI"/>
+          <w:color w:val="242424"/>
+          <w:sz w:val="21"/>
+          <w:szCs w:val="21"/>
+        </w:rPr>
+        <w:t xml:space="preserve">İki kaynaktan öğreniyor, ikisi de ek ücret doğurmuyor: konuşurken söyledikleriniz (zaten yapılan çağrının içinde) ve taramadan sonra çalışan modelsiz sayım — kiminle kaç kez yazışıldığı, hangi adın tekrar ettiği.</w:t>
+      </w:r>
+    </w:p>
+    <w:p>
+      <w:pPr>
+        <w:pStyle w:val="ListParagraph"/>
+        <w:numPr>
+          <w:ilvl w:val="0"/>
+          <w:numId w:val="2"/>
+        </w:numPr>
+        <w:spacing w:after="60" w:line="276"/>
+      </w:pPr>
+      <w:r>
+        <w:rPr>
+          <w:rFonts w:ascii="Segoe UI" w:cs="Segoe UI" w:eastAsia="Segoe UI" w:hAnsi="Segoe UI"/>
+          <w:color w:val="242424"/>
+          <w:sz w:val="21"/>
+          <w:szCs w:val="21"/>
+        </w:rPr>
+        <w:t xml:space="preserve">Mail gövdelerinden model çıkarımı bilerek yapılmıyor: her taramaya bir çağrı bindirir ve içerik modele daha çok giderdi.</w:t>
+      </w:r>
+    </w:p>
+    <w:p>
+      <w:pPr>
+        <w:pStyle w:val="ListParagraph"/>
+        <w:numPr>
+          <w:ilvl w:val="0"/>
+          <w:numId w:val="2"/>
+        </w:numPr>
+        <w:spacing w:after="60" w:line="276"/>
+      </w:pPr>
+      <w:r>
+        <w:rPr>
+          <w:rFonts w:ascii="Segoe UI" w:cs="Segoe UI" w:eastAsia="Segoe UI" w:hAnsi="Segoe UI"/>
+          <w:color w:val="242424"/>
+          <w:sz w:val="21"/>
+          <w:szCs w:val="21"/>
+        </w:rPr>
+        <w:t xml:space="preserve">Öğrenilenler sinyal satırında görünüyor (“hafiza: mimarlık +25”); hiçbir ağırlık sessiz uygulanmıyor.</w:t>
+      </w:r>
+    </w:p>
+    <w:p>
+      <w:pPr>
+        <w:pStyle w:val="ListParagraph"/>
+        <w:numPr>
+          <w:ilvl w:val="0"/>
+          <w:numId w:val="2"/>
+        </w:numPr>
+        <w:spacing w:after="60" w:line="276"/>
+      </w:pPr>
+      <w:r>
+        <w:rPr>
+          <w:rFonts w:ascii="Segoe UI" w:cs="Segoe UI" w:eastAsia="Segoe UI" w:hAnsi="Segoe UI"/>
+          <w:color w:val="242424"/>
+          <w:sz w:val="21"/>
+          <w:szCs w:val="21"/>
+        </w:rPr>
+        <w:t xml:space="preserve">Depo append-only: bilgi silinmiyor, unutma da bir satır. “Ne zamandan beri böyle biliyor” sorusu cevaplanabilir kalıyor.</w:t>
+      </w:r>
+    </w:p>
+    <w:p>
+      <w:pPr>
+        <w:pStyle w:val="ListParagraph"/>
+        <w:numPr>
+          <w:ilvl w:val="0"/>
+          <w:numId w:val="2"/>
+        </w:numPr>
+        <w:spacing w:after="60" w:line="276"/>
+      </w:pPr>
+      <w:r>
+        <w:rPr>
+          <w:rFonts w:ascii="Segoe UI" w:cs="Segoe UI" w:eastAsia="Segoe UI" w:hAnsi="Segoe UI"/>
+          <w:color w:val="242424"/>
+          <w:sz w:val="21"/>
+          <w:szCs w:val="21"/>
+        </w:rPr>
+        <w:t xml:space="preserve">Üç sınır bilerek kondu: bir maile toplam katkı ±40; bir bilgi 90 günde yarıya, 180 günde çeyreğe iniyor (kayıt duruyor, etkisi sönüyor); VIP ve “bu adrese yazdınız” sinyallerinin altında sıralanıyor.</w:t>
+      </w:r>
+    </w:p>
+    <w:p>
+      <w:pPr>
+        <w:pStyle w:val="ListParagraph"/>
+        <w:numPr>
+          <w:ilvl w:val="0"/>
+          <w:numId w:val="2"/>
+        </w:numPr>
+        <w:spacing w:after="60" w:line="276"/>
+      </w:pPr>
+      <w:r>
+        <w:rPr>
+          <w:rFonts w:ascii="Segoe UI" w:cs="Segoe UI" w:eastAsia="Segoe UI" w:hAnsi="Segoe UI"/>
+          <w:color w:val="242424"/>
+          <w:sz w:val="21"/>
+          <w:szCs w:val="21"/>
+        </w:rPr>
+        <w:t xml:space="preserve">Defter'e Hafıza sekmesi eklendi: ne öğrendiği, nereden öğrendiği, kaç kez doğrulandığı yazılı. Yanlış olan kaldırılıyor, önemi değiştirilebiliyor.</w:t>
+      </w:r>
+    </w:p>
+    <w:p>
+      <w:pPr>
+        <w:pStyle w:val="ListParagraph"/>
+        <w:numPr>
+          <w:ilvl w:val="0"/>
+          <w:numId w:val="2"/>
+        </w:numPr>
+        <w:spacing w:after="60" w:line="276"/>
+      </w:pPr>
+      <w:r>
+        <w:rPr>
+          <w:rFonts w:ascii="Segoe UI" w:cs="Segoe UI" w:eastAsia="Segoe UI" w:hAnsi="Segoe UI"/>
+          <w:color w:val="242424"/>
+          <w:sz w:val="21"/>
+          <w:szCs w:val="21"/>
+        </w:rPr>
+        <w:t xml:space="preserve">Hafıza dosyası projenin en kişisel dosyası; sürüm kontrolüne girmiyor.</w:t>
+      </w:r>
+    </w:p>
+    <w:p>
+      <w:pPr>
+        <w:spacing w:after="120" w:line="276"/>
+      </w:pPr>
+      <w:r>
+        <w:rPr>
+          <w:rFonts w:ascii="Segoe UI" w:cs="Segoe UI" w:eastAsia="Segoe UI" w:hAnsi="Segoe UI"/>
+          <w:color w:val="616161"/>
+          <w:sz w:val="19"/>
+          <w:szCs w:val="19"/>
+        </w:rPr>
+        <w:t xml:space="preserve">Testler: hafıza 53/53 (yeni), skorlama 51/51 — hafıza boşken skorların birebir aynı kaldığı da doğrulandı.</w:t>
       </w:r>
     </w:p>
     <w:p>

</xml_diff>